<commit_message>
Behavioral Sciences package: formal risk of bias, sensitivity analyses, reclassification
Re-assess all 47 reports with RoB 2, ROBINS-I, or WWC single-case standards
using stated decision rules; add sensitivity analyses (Table 3); reclassify
Leong (1995) as excluded from its abstract and split excluded (Table S6) from
awaiting-classification reports (Table S7, with potential contribution);
document Phase 1 search auditability limits; remove placeholder link and
correct submission wording.

Co-Authored-By: Claude Opus 5.5 <noreply@anthropic.com>
Claude-Session: https://claude.ai/code/session_015fmNdJTBtvm9FTn4Grj7NX
</commit_message>
<xml_diff>
--- a/submission_behavsci/03_PRISMA_SWiM_PRISMA-S_Checklists.docx
+++ b/submission_behavsci/03_PRISMA_SWiM_PRISMA-S_Checklists.docx
@@ -1207,7 +1207,7 @@
                 <w:i w:val="0"/>
                 <w:sz w:val="16"/>
               </w:rPr>
-              <w:t>Section 2.7; Table S3. Note: structured critical appraisal replaced formal tool ratings (Table S4)</w:t>
+              <w:t>Section 2.7; Table S3 (RoB 2, ROBINS-I, WWC single-case standards; decision rules stated; not performed in duplicate)</w:t>
             </w:r>
           </w:p>
         </w:tc>
@@ -1734,7 +1734,7 @@
                 <w:i w:val="0"/>
                 <w:sz w:val="16"/>
               </w:rPr>
-              <w:t>Not performed (Table S4)</w:t>
+              <w:t>Section 2.8 (post hoc: restriction to full-text-verified reports and to reports at no more than some concerns)</w:t>
             </w:r>
           </w:p>
         </w:tc>
@@ -2073,7 +2073,7 @@
                 <w:i w:val="0"/>
                 <w:sz w:val="16"/>
               </w:rPr>
-              <w:t>Section 3.1; Table S6. Note: Phase 1 citation-level exclusion list not retained</w:t>
+              <w:t>Section 3.1; Tables S6 and S7. Note: Phase 1 citation-level exclusion list not retained</w:t>
             </w:r>
           </w:p>
         </w:tc>
@@ -2235,7 +2235,7 @@
                 <w:i w:val="0"/>
                 <w:sz w:val="16"/>
               </w:rPr>
-              <w:t>Section 3.3; Table S3</w:t>
+              <w:t>Section 3.3; Table 1; Table S3</w:t>
             </w:r>
           </w:p>
         </w:tc>
@@ -2616,7 +2616,7 @@
                 <w:i w:val="0"/>
                 <w:sz w:val="16"/>
               </w:rPr>
-              <w:t>Not applicable (none performed)</w:t>
+              <w:t>Section 3.9; Table 3</w:t>
             </w:r>
           </w:p>
         </w:tc>
@@ -2697,7 +2697,7 @@
                 <w:i w:val="0"/>
                 <w:sz w:val="16"/>
               </w:rPr>
-              <w:t>Sections 3.8 and 4.5</w:t>
+              <w:t>Sections 3.1, 3.8, and 4.5; Table S7</w:t>
             </w:r>
           </w:p>
         </w:tc>
@@ -4102,7 +4102,7 @@
                 <w:i w:val="0"/>
                 <w:sz w:val="16"/>
               </w:rPr>
-              <w:t>Not stated owing to the 200-word limit; Section 2.7</w:t>
+              <w:t>Yes (RoB 2, ROBINS-I, single-case design standards)</w:t>
             </w:r>
           </w:p>
         </w:tc>
@@ -5169,7 +5169,7 @@
                 <w:i w:val="0"/>
                 <w:sz w:val="16"/>
               </w:rPr>
-              <w:t>Sections 2.6–2.8 (measurement condition, design, verification depth, cohort dependence)</w:t>
+              <w:t>Sections 2.6–2.8 (measurement condition, risk of bias, verification depth, cohort dependence); Table 3</w:t>
             </w:r>
           </w:p>
         </w:tc>
@@ -5250,7 +5250,7 @@
                 <w:i w:val="0"/>
                 <w:sz w:val="16"/>
               </w:rPr>
-              <w:t>Section 2.6; Sections 3.4–3.7 and 4.2</w:t>
+              <w:t>Section 2.6; Sections 3.4–3.7, 3.9, and 4.2</w:t>
             </w:r>
           </w:p>
         </w:tc>
@@ -5331,7 +5331,7 @@
                 <w:i w:val="0"/>
                 <w:sz w:val="16"/>
               </w:rPr>
-              <w:t>Section 2.8; Table 2</w:t>
+              <w:t>Section 2.8; Tables 2–3</w:t>
             </w:r>
           </w:p>
         </w:tc>

</xml_diff>